<commit_message>
Remove website link from CV header
</commit_message>
<xml_diff>
--- a/public/Dao_Quang_Truong_CV.docx
+++ b/public/Dao_Quang_Truong_CV.docx
@@ -54,27 +54,14 @@
       <w:pPr>
         <w:rPr/>
       </w:pPr>
-      <w:hyperlink r:id="rId6">
-        <w:r>
-          <w:rPr>
-            <w:rFonts w:ascii="Times New Roman" w:cs="Times New Roman" w:eastAsia="Times New Roman" w:hAnsi="Times New Roman"/>
-            <w:color w:val="1155cc"/>
-            <w:sz w:val="28"/>
-            <w:szCs w:val="28"/>
-            <w:u w:val="single"/>
-            <w:rtl w:val="0"/>
-          </w:rPr>
-          <w:t xml:space="preserve">truongdq.com</w:t>
-        </w:r>
-      </w:hyperlink>
-      <w:r>
-        <w:rPr>
-          <w:rFonts w:ascii="Times New Roman" w:cs="Times New Roman" w:eastAsia="Times New Roman" w:hAnsi="Times New Roman"/>
-          <w:sz w:val="28"/>
-          <w:szCs w:val="28"/>
-          <w:rtl w:val="0"/>
-        </w:rPr>
-        <w:t xml:space="preserve"> |  github.com/truongnat</w:t>
+      <w:r>
+        <w:rPr>
+          <w:rFonts w:ascii="Times New Roman" w:cs="Times New Roman" w:eastAsia="Times New Roman" w:hAnsi="Times New Roman"/>
+          <w:sz w:val="28"/>
+          <w:szCs w:val="28"/>
+          <w:rtl w:val="0"/>
+        </w:rPr>
+        <w:t xml:space="preserve">github.com/truongnat</w:t>
       </w:r>
       <w:r>
         <w:rPr>

</xml_diff>

<commit_message>
Expand one-page CV details
</commit_message>
<xml_diff>
--- a/public/Dao_Quang_Truong_CV.docx
+++ b/public/Dao_Quang_Truong_CV.docx
@@ -91,7 +91,7 @@
           <w:i w:val="0"/>
           <w:sz w:val="18"/>
         </w:rPr>
-        <w:t>Middle+ Fullstack Developer with 6 years of professional experience building enterprise web, mobile, and cross-platform systems. Strong in TypeScript, React, Next.js, Node.js, NestJS, PostgreSQL, and system design. Currently at VIETIS delivering Japanese school-management/OCR and ERP accounting/reporting products; prior work includes Viettel and Naver projects and mentoring 8+ engineers.</w:t>
+        <w:t>Middle+ Fullstack Developer with 6 years of professional experience delivering enterprise web, mobile, and cross-platform systems. Strong in TypeScript, React, Next.js, Node.js, NestJS, PostgreSQL, and system design, with hands-on ownership from feature development through debugging and delivery. Currently at VIETIS building Japanese education and ERP accounting products; prior work includes Viettel and Naver projects and mentoring 8+ engineers.</w:t>
       </w:r>
     </w:p>
     <w:p>
@@ -158,7 +158,7 @@
           <w:i w:val="0"/>
           <w:sz w:val="18"/>
         </w:rPr>
-        <w:t xml:space="preserve">Student &amp; Teacher Management: </w:t>
+        <w:t xml:space="preserve">Product scope: </w:t>
       </w:r>
       <w:r>
         <w:rPr>
@@ -167,7 +167,7 @@
           <w:i w:val="0"/>
           <w:sz w:val="18"/>
         </w:rPr>
-        <w:t>Built features for student and teacher administration.</w:t>
+        <w:t>Japanese school-management platform with student and teacher administration plus OCR-based exam scanning and scoring.</w:t>
       </w:r>
     </w:p>
     <w:p>
@@ -184,7 +184,7 @@
           <w:i w:val="0"/>
           <w:sz w:val="18"/>
         </w:rPr>
-        <w:t xml:space="preserve">OCR &amp; Identity: </w:t>
+        <w:t xml:space="preserve">Feature delivery: </w:t>
       </w:r>
       <w:r>
         <w:rPr>
@@ -193,7 +193,7 @@
           <w:i w:val="0"/>
           <w:sz w:val="18"/>
         </w:rPr>
-        <w:t>Fixed OCR exam scoring issues and resolved Keycloak authentication and authorization issues.</w:t>
+        <w:t>Developed student and teacher management features using Next.js frontend and NestJS backend.</w:t>
       </w:r>
     </w:p>
     <w:p>
@@ -210,7 +210,33 @@
           <w:i w:val="0"/>
           <w:sz w:val="18"/>
         </w:rPr>
-        <w:t xml:space="preserve">Tech: </w:t>
+        <w:t xml:space="preserve">Quality &amp; access: </w:t>
+      </w:r>
+      <w:r>
+        <w:rPr>
+          <w:rFonts w:ascii="Times New Roman" w:hAnsi="Times New Roman" w:eastAsia="Times New Roman"/>
+          <w:b w:val="0"/>
+          <w:i w:val="0"/>
+          <w:sz w:val="18"/>
+        </w:rPr>
+        <w:t>Fixed OCR scoring and scan-processing issues; investigated and resolved Keycloak authentication and authorization issues.</w:t>
+      </w:r>
+    </w:p>
+    <w:p>
+      <w:pPr>
+        <w:pStyle w:val="ListBullet"/>
+        <w:widowControl/>
+        <w:spacing w:before="0" w:after="5" w:line="226" w:lineRule="auto"/>
+        <w:ind w:left="340" w:hanging="198"/>
+      </w:pPr>
+      <w:r>
+        <w:rPr>
+          <w:rFonts w:ascii="Times New Roman" w:hAnsi="Times New Roman" w:eastAsia="Times New Roman"/>
+          <w:b/>
+          <w:i w:val="0"/>
+          <w:sz w:val="18"/>
+        </w:rPr>
+        <w:t xml:space="preserve">Tech stack: </w:t>
       </w:r>
       <w:r>
         <w:rPr>
@@ -253,7 +279,7 @@
           <w:i w:val="0"/>
           <w:sz w:val="18"/>
         </w:rPr>
-        <w:t xml:space="preserve">Reporting &amp; Export: </w:t>
+        <w:t xml:space="preserve">Product scope: </w:t>
       </w:r>
       <w:r>
         <w:rPr>
@@ -262,7 +288,7 @@
           <w:i w:val="0"/>
           <w:sz w:val="18"/>
         </w:rPr>
-        <w:t>Developed business-rule-driven reports, file export, and document-generation workflows.</w:t>
+        <w:t>Enterprise ERP accounting platform supporting business-rule-driven reporting and operational workflows.</w:t>
       </w:r>
     </w:p>
     <w:p>
@@ -279,7 +305,7 @@
           <w:i w:val="0"/>
           <w:sz w:val="18"/>
         </w:rPr>
-        <w:t xml:space="preserve">Tech: </w:t>
+        <w:t xml:space="preserve">Ownership: </w:t>
       </w:r>
       <w:r>
         <w:rPr>
@@ -288,7 +314,33 @@
           <w:i w:val="0"/>
           <w:sz w:val="18"/>
         </w:rPr>
-        <w:t>TanStack React, TypeScript, C# backend.</w:t>
+        <w:t>Developed report features and implemented file export and file-generation workflows based on business requirements.</w:t>
+      </w:r>
+    </w:p>
+    <w:p>
+      <w:pPr>
+        <w:pStyle w:val="ListBullet"/>
+        <w:widowControl/>
+        <w:spacing w:before="0" w:after="5" w:line="226" w:lineRule="auto"/>
+        <w:ind w:left="340" w:hanging="198"/>
+      </w:pPr>
+      <w:r>
+        <w:rPr>
+          <w:rFonts w:ascii="Times New Roman" w:hAnsi="Times New Roman" w:eastAsia="Times New Roman"/>
+          <w:b/>
+          <w:i w:val="0"/>
+          <w:sz w:val="18"/>
+        </w:rPr>
+        <w:t xml:space="preserve">Tech stack: </w:t>
+      </w:r>
+      <w:r>
+        <w:rPr>
+          <w:rFonts w:ascii="Times New Roman" w:hAnsi="Times New Roman" w:eastAsia="Times New Roman"/>
+          <w:b w:val="0"/>
+          <w:i w:val="0"/>
+          <w:sz w:val="18"/>
+        </w:rPr>
+        <w:t>TanStack React frontend, TypeScript, and C# backend.</w:t>
       </w:r>
     </w:p>
     <w:p>
@@ -330,7 +382,7 @@
           <w:i w:val="0"/>
           <w:sz w:val="18"/>
         </w:rPr>
-        <w:t>Led and mentored 8 engineers; established technical interview and mentorship practices.</w:t>
+        <w:t>Led and mentored 8 engineers; built technical interview and mentorship practices for team growth.</w:t>
       </w:r>
     </w:p>
     <w:p>
@@ -347,7 +399,7 @@
           <w:i w:val="0"/>
           <w:sz w:val="18"/>
         </w:rPr>
-        <w:t xml:space="preserve">Delivery: </w:t>
+        <w:t xml:space="preserve">Architecture: </w:t>
       </w:r>
       <w:r>
         <w:rPr>
@@ -356,7 +408,33 @@
           <w:i w:val="0"/>
           <w:sz w:val="18"/>
         </w:rPr>
-        <w:t>Refactored Node.js services, reducing API latency by 50%; built KPI and Viettel Cloud features with React, TypeScript, and Node.js.</w:t>
+        <w:t>Refactored legacy Node.js services, reducing API latency by 50% and improving peak-load reliability.</w:t>
+      </w:r>
+    </w:p>
+    <w:p>
+      <w:pPr>
+        <w:pStyle w:val="ListBullet"/>
+        <w:widowControl/>
+        <w:spacing w:before="0" w:after="5" w:line="226" w:lineRule="auto"/>
+        <w:ind w:left="340" w:hanging="198"/>
+      </w:pPr>
+      <w:r>
+        <w:rPr>
+          <w:rFonts w:ascii="Times New Roman" w:hAnsi="Times New Roman" w:eastAsia="Times New Roman"/>
+          <w:b/>
+          <w:i w:val="0"/>
+          <w:sz w:val="18"/>
+        </w:rPr>
+        <w:t xml:space="preserve">Product delivery: </w:t>
+      </w:r>
+      <w:r>
+        <w:rPr>
+          <w:rFonts w:ascii="Times New Roman" w:hAnsi="Times New Roman" w:eastAsia="Times New Roman"/>
+          <w:b w:val="0"/>
+          <w:i w:val="0"/>
+          <w:sz w:val="18"/>
+        </w:rPr>
+        <w:t>Built KPI management and Viettel Cloud features with React, TypeScript, and Node.js; introduced ESLint and Git flow standards.</w:t>
       </w:r>
     </w:p>
     <w:p>
@@ -389,7 +467,7 @@
           <w:i w:val="0"/>
           <w:sz w:val="18"/>
         </w:rPr>
-        <w:t xml:space="preserve">Cross-platform: </w:t>
+        <w:t xml:space="preserve">Naver Cloud Meeting: </w:t>
       </w:r>
       <w:r>
         <w:rPr>
@@ -398,7 +476,7 @@
           <w:i w:val="0"/>
           <w:sz w:val="18"/>
         </w:rPr>
-        <w:t>Delivered video conferencing across Vue.js web, Electron desktop, and React Native mobile; implemented RTC synchronization.</w:t>
+        <w:t>Engineered video conferencing across Vue.js web, Electron desktop, and React Native mobile; implemented RTC media synchronization and joined architecture/code reviews.</w:t>
       </w:r>
     </w:p>
     <w:p>
@@ -440,7 +518,7 @@
           <w:i w:val="0"/>
           <w:sz w:val="18"/>
         </w:rPr>
-        <w:t>Built core features for a React Native low-code app-generation and e-learning platform.</w:t>
+        <w:t>Built core features for a React Native low-code app-generation platform and GoPass exam/e-learning application.</w:t>
       </w:r>
     </w:p>
     <w:p>

</xml_diff>

<commit_message>
Polish one-page CV layout and detail
</commit_message>
<xml_diff>
--- a/public/Dao_Quang_Truong_CV.docx
+++ b/public/Dao_Quang_Truong_CV.docx
@@ -5,14 +5,14 @@
     <w:p>
       <w:pPr>
         <w:widowControl/>
-        <w:spacing w:before="0" w:after="6" w:line="240" w:lineRule="auto"/>
+        <w:spacing w:before="0" w:after="10" w:line="240" w:lineRule="auto"/>
       </w:pPr>
       <w:r>
         <w:rPr>
           <w:rFonts w:ascii="Times New Roman" w:hAnsi="Times New Roman" w:eastAsia="Times New Roman"/>
           <w:b/>
           <w:i w:val="0"/>
-          <w:sz w:val="35"/>
+          <w:sz w:val="41"/>
         </w:rPr>
         <w:t>DAO QUANG TRUONG | 17-06-2001</w:t>
       </w:r>
@@ -20,14 +20,14 @@
     <w:p>
       <w:pPr>
         <w:widowControl/>
-        <w:spacing w:before="0" w:after="6" w:line="240" w:lineRule="auto"/>
+        <w:spacing w:before="0" w:after="9" w:line="240" w:lineRule="auto"/>
       </w:pPr>
       <w:r>
         <w:rPr>
           <w:rFonts w:ascii="Times New Roman" w:hAnsi="Times New Roman" w:eastAsia="Times New Roman"/>
           <w:b w:val="0"/>
           <w:i w:val="0"/>
-          <w:sz w:val="23"/>
+          <w:sz w:val="27"/>
         </w:rPr>
         <w:t>Middle+ Fullstack Developer</w:t>
       </w:r>
@@ -35,14 +35,14 @@
     <w:p>
       <w:pPr>
         <w:widowControl/>
-        <w:spacing w:before="0" w:after="5" w:line="240" w:lineRule="auto"/>
+        <w:spacing w:before="0" w:after="8" w:line="240" w:lineRule="auto"/>
       </w:pPr>
       <w:r>
         <w:rPr>
           <w:rFonts w:ascii="Times New Roman" w:hAnsi="Times New Roman" w:eastAsia="Times New Roman"/>
           <w:b w:val="0"/>
           <w:i w:val="0"/>
-          <w:sz w:val="19"/>
+          <w:sz w:val="21"/>
         </w:rPr>
         <w:t>Ninh Binh, Vietnam  |  (+84) 96 906 9035  |  truongdq.dev@gmail.com</w:t>
       </w:r>
@@ -50,14 +50,14 @@
     <w:p>
       <w:pPr>
         <w:widowControl/>
-        <w:spacing w:before="0" w:after="5" w:line="240" w:lineRule="auto"/>
+        <w:spacing w:before="0" w:after="8" w:line="240" w:lineRule="auto"/>
       </w:pPr>
       <w:r>
         <w:rPr>
           <w:rFonts w:ascii="Times New Roman" w:hAnsi="Times New Roman" w:eastAsia="Times New Roman"/>
           <w:b w:val="0"/>
           <w:i w:val="0"/>
-          <w:sz w:val="19"/>
+          <w:sz w:val="21"/>
         </w:rPr>
         <w:t>github.com/truongnat</w:t>
       </w:r>
@@ -65,7 +65,7 @@
     <w:p>
       <w:pPr>
         <w:widowControl/>
-        <w:spacing w:before="110" w:after="50" w:line="240" w:lineRule="auto"/>
+        <w:spacing w:before="150" w:after="70" w:line="240" w:lineRule="auto"/>
         <w:jc w:val="center"/>
         <w:keepNext/>
       </w:pPr>
@@ -74,7 +74,7 @@
           <w:rFonts w:ascii="Times New Roman" w:hAnsi="Times New Roman" w:eastAsia="Times New Roman"/>
           <w:b/>
           <w:i w:val="0"/>
-          <w:sz w:val="25"/>
+          <w:sz w:val="29"/>
         </w:rPr>
         <w:t>SUMMARY</w:t>
       </w:r>
@@ -82,14 +82,14 @@
     <w:p>
       <w:pPr>
         <w:widowControl/>
-        <w:spacing w:before="0" w:after="6" w:line="226" w:lineRule="auto"/>
+        <w:spacing w:before="0" w:after="14" w:line="240" w:lineRule="auto"/>
       </w:pPr>
       <w:r>
         <w:rPr>
           <w:rFonts w:ascii="Times New Roman" w:hAnsi="Times New Roman" w:eastAsia="Times New Roman"/>
           <w:b w:val="0"/>
           <w:i w:val="0"/>
-          <w:sz w:val="18"/>
+          <w:sz w:val="21"/>
         </w:rPr>
         <w:t>Middle+ Fullstack Developer with 6 years of professional experience delivering enterprise web, mobile, and cross-platform systems. Strong in TypeScript, React, Next.js, Node.js, NestJS, PostgreSQL, and system design, with hands-on ownership from feature development through debugging and delivery. Currently at VIETIS building Japanese education and ERP accounting products; prior work includes Viettel and Naver projects and mentoring 8+ engineers.</w:t>
       </w:r>
@@ -97,7 +97,7 @@
     <w:p>
       <w:pPr>
         <w:widowControl/>
-        <w:spacing w:before="110" w:after="50" w:line="240" w:lineRule="auto"/>
+        <w:spacing w:before="150" w:after="70" w:line="240" w:lineRule="auto"/>
         <w:jc w:val="center"/>
         <w:keepNext/>
       </w:pPr>
@@ -106,7 +106,7 @@
           <w:rFonts w:ascii="Times New Roman" w:hAnsi="Times New Roman" w:eastAsia="Times New Roman"/>
           <w:b/>
           <w:i w:val="0"/>
-          <w:sz w:val="25"/>
+          <w:sz w:val="29"/>
         </w:rPr>
         <w:t>WORK EXPERIENCE</w:t>
       </w:r>
@@ -114,7 +114,7 @@
     <w:p>
       <w:pPr>
         <w:widowControl/>
-        <w:spacing w:before="30" w:after="10" w:line="230" w:lineRule="auto"/>
+        <w:spacing w:before="48" w:after="20" w:line="240" w:lineRule="auto"/>
         <w:keepNext/>
       </w:pPr>
       <w:r>
@@ -122,7 +122,7 @@
           <w:rFonts w:ascii="Times New Roman" w:hAnsi="Times New Roman" w:eastAsia="Times New Roman"/>
           <w:b/>
           <w:i w:val="0"/>
-          <w:sz w:val="20"/>
+          <w:sz w:val="23"/>
         </w:rPr>
         <w:t>Fullstack Developer | VIETIS | Mar 2026 - Present</w:t>
       </w:r>
@@ -130,7 +130,7 @@
     <w:p>
       <w:pPr>
         <w:widowControl/>
-        <w:spacing w:before="20" w:after="4" w:line="230" w:lineRule="auto"/>
+        <w:spacing w:before="28" w:after="10" w:line="240" w:lineRule="auto"/>
         <w:ind w:left="198"/>
         <w:keepNext/>
       </w:pPr>
@@ -139,7 +139,7 @@
           <w:rFonts w:ascii="Times New Roman" w:hAnsi="Times New Roman" w:eastAsia="Times New Roman"/>
           <w:b/>
           <w:i w:val="0"/>
-          <w:sz w:val="19"/>
+          <w:sz w:val="22"/>
         </w:rPr>
         <w:t>Japanese School Management &amp; OCR Assessment Platform</w:t>
       </w:r>
@@ -148,7 +148,7 @@
       <w:pPr>
         <w:pStyle w:val="ListBullet"/>
         <w:widowControl/>
-        <w:spacing w:before="0" w:after="5" w:line="226" w:lineRule="auto"/>
+        <w:spacing w:before="0" w:after="15" w:line="240" w:lineRule="auto"/>
         <w:ind w:left="340" w:hanging="198"/>
       </w:pPr>
       <w:r>
@@ -156,7 +156,7 @@
           <w:rFonts w:ascii="Times New Roman" w:hAnsi="Times New Roman" w:eastAsia="Times New Roman"/>
           <w:b/>
           <w:i w:val="0"/>
-          <w:sz w:val="18"/>
+          <w:sz w:val="21"/>
         </w:rPr>
         <w:t xml:space="preserve">Product scope: </w:t>
       </w:r>
@@ -165,7 +165,7 @@
           <w:rFonts w:ascii="Times New Roman" w:hAnsi="Times New Roman" w:eastAsia="Times New Roman"/>
           <w:b w:val="0"/>
           <w:i w:val="0"/>
-          <w:sz w:val="18"/>
+          <w:sz w:val="21"/>
         </w:rPr>
         <w:t>Japanese school-management platform with student and teacher administration plus OCR-based exam scanning and scoring.</w:t>
       </w:r>
@@ -174,7 +174,7 @@
       <w:pPr>
         <w:pStyle w:val="ListBullet"/>
         <w:widowControl/>
-        <w:spacing w:before="0" w:after="5" w:line="226" w:lineRule="auto"/>
+        <w:spacing w:before="0" w:after="15" w:line="240" w:lineRule="auto"/>
         <w:ind w:left="340" w:hanging="198"/>
       </w:pPr>
       <w:r>
@@ -182,7 +182,7 @@
           <w:rFonts w:ascii="Times New Roman" w:hAnsi="Times New Roman" w:eastAsia="Times New Roman"/>
           <w:b/>
           <w:i w:val="0"/>
-          <w:sz w:val="18"/>
+          <w:sz w:val="21"/>
         </w:rPr>
         <w:t xml:space="preserve">Feature delivery: </w:t>
       </w:r>
@@ -191,7 +191,7 @@
           <w:rFonts w:ascii="Times New Roman" w:hAnsi="Times New Roman" w:eastAsia="Times New Roman"/>
           <w:b w:val="0"/>
           <w:i w:val="0"/>
-          <w:sz w:val="18"/>
+          <w:sz w:val="21"/>
         </w:rPr>
         <w:t>Developed student and teacher management features using Next.js frontend and NestJS backend.</w:t>
       </w:r>
@@ -200,7 +200,7 @@
       <w:pPr>
         <w:pStyle w:val="ListBullet"/>
         <w:widowControl/>
-        <w:spacing w:before="0" w:after="5" w:line="226" w:lineRule="auto"/>
+        <w:spacing w:before="0" w:after="15" w:line="240" w:lineRule="auto"/>
         <w:ind w:left="340" w:hanging="198"/>
       </w:pPr>
       <w:r>
@@ -208,25 +208,25 @@
           <w:rFonts w:ascii="Times New Roman" w:hAnsi="Times New Roman" w:eastAsia="Times New Roman"/>
           <w:b/>
           <w:i w:val="0"/>
-          <w:sz w:val="18"/>
+          <w:sz w:val="21"/>
         </w:rPr>
-        <w:t xml:space="preserve">Quality &amp; access: </w:t>
+        <w:t xml:space="preserve">OCR scoring: </w:t>
       </w:r>
       <w:r>
         <w:rPr>
           <w:rFonts w:ascii="Times New Roman" w:hAnsi="Times New Roman" w:eastAsia="Times New Roman"/>
           <w:b w:val="0"/>
           <w:i w:val="0"/>
-          <w:sz w:val="18"/>
+          <w:sz w:val="21"/>
         </w:rPr>
-        <w:t>Fixed OCR scoring and scan-processing issues; investigated and resolved Keycloak authentication and authorization issues.</w:t>
+        <w:t>Fixed exam scoring and scan-processing issues, improving the reliability of OCR assessment results.</w:t>
       </w:r>
     </w:p>
     <w:p>
       <w:pPr>
         <w:pStyle w:val="ListBullet"/>
         <w:widowControl/>
-        <w:spacing w:before="0" w:after="5" w:line="226" w:lineRule="auto"/>
+        <w:spacing w:before="0" w:after="15" w:line="240" w:lineRule="auto"/>
         <w:ind w:left="340" w:hanging="198"/>
       </w:pPr>
       <w:r>
@@ -234,7 +234,33 @@
           <w:rFonts w:ascii="Times New Roman" w:hAnsi="Times New Roman" w:eastAsia="Times New Roman"/>
           <w:b/>
           <w:i w:val="0"/>
-          <w:sz w:val="18"/>
+          <w:sz w:val="21"/>
+        </w:rPr>
+        <w:t xml:space="preserve">Identity &amp; access: </w:t>
+      </w:r>
+      <w:r>
+        <w:rPr>
+          <w:rFonts w:ascii="Times New Roman" w:hAnsi="Times New Roman" w:eastAsia="Times New Roman"/>
+          <w:b w:val="0"/>
+          <w:i w:val="0"/>
+          <w:sz w:val="21"/>
+        </w:rPr>
+        <w:t>Investigated and resolved Keycloak authentication and authorization issues across the application workflow.</w:t>
+      </w:r>
+    </w:p>
+    <w:p>
+      <w:pPr>
+        <w:pStyle w:val="ListBullet"/>
+        <w:widowControl/>
+        <w:spacing w:before="0" w:after="15" w:line="240" w:lineRule="auto"/>
+        <w:ind w:left="340" w:hanging="198"/>
+      </w:pPr>
+      <w:r>
+        <w:rPr>
+          <w:rFonts w:ascii="Times New Roman" w:hAnsi="Times New Roman" w:eastAsia="Times New Roman"/>
+          <w:b/>
+          <w:i w:val="0"/>
+          <w:sz w:val="21"/>
         </w:rPr>
         <w:t xml:space="preserve">Tech stack: </w:t>
       </w:r>
@@ -243,7 +269,7 @@
           <w:rFonts w:ascii="Times New Roman" w:hAnsi="Times New Roman" w:eastAsia="Times New Roman"/>
           <w:b w:val="0"/>
           <w:i w:val="0"/>
-          <w:sz w:val="18"/>
+          <w:sz w:val="21"/>
         </w:rPr>
         <w:t>Next.js, React, TypeScript, NestJS, OCR, Keycloak.</w:t>
       </w:r>
@@ -251,7 +277,7 @@
     <w:p>
       <w:pPr>
         <w:widowControl/>
-        <w:spacing w:before="20" w:after="4" w:line="230" w:lineRule="auto"/>
+        <w:spacing w:before="28" w:after="10" w:line="240" w:lineRule="auto"/>
         <w:ind w:left="198"/>
         <w:keepNext/>
       </w:pPr>
@@ -260,7 +286,7 @@
           <w:rFonts w:ascii="Times New Roman" w:hAnsi="Times New Roman" w:eastAsia="Times New Roman"/>
           <w:b/>
           <w:i w:val="0"/>
-          <w:sz w:val="19"/>
+          <w:sz w:val="22"/>
         </w:rPr>
         <w:t>Enterprise ERP Accounting &amp; Reporting Platform</w:t>
       </w:r>
@@ -269,7 +295,7 @@
       <w:pPr>
         <w:pStyle w:val="ListBullet"/>
         <w:widowControl/>
-        <w:spacing w:before="0" w:after="5" w:line="226" w:lineRule="auto"/>
+        <w:spacing w:before="0" w:after="15" w:line="240" w:lineRule="auto"/>
         <w:ind w:left="340" w:hanging="198"/>
       </w:pPr>
       <w:r>
@@ -277,7 +303,7 @@
           <w:rFonts w:ascii="Times New Roman" w:hAnsi="Times New Roman" w:eastAsia="Times New Roman"/>
           <w:b/>
           <w:i w:val="0"/>
-          <w:sz w:val="18"/>
+          <w:sz w:val="21"/>
         </w:rPr>
         <w:t xml:space="preserve">Product scope: </w:t>
       </w:r>
@@ -286,7 +312,7 @@
           <w:rFonts w:ascii="Times New Roman" w:hAnsi="Times New Roman" w:eastAsia="Times New Roman"/>
           <w:b w:val="0"/>
           <w:i w:val="0"/>
-          <w:sz w:val="18"/>
+          <w:sz w:val="21"/>
         </w:rPr>
         <w:t>Enterprise ERP accounting platform supporting business-rule-driven reporting and operational workflows.</w:t>
       </w:r>
@@ -295,7 +321,7 @@
       <w:pPr>
         <w:pStyle w:val="ListBullet"/>
         <w:widowControl/>
-        <w:spacing w:before="0" w:after="5" w:line="226" w:lineRule="auto"/>
+        <w:spacing w:before="0" w:after="15" w:line="240" w:lineRule="auto"/>
         <w:ind w:left="340" w:hanging="198"/>
       </w:pPr>
       <w:r>
@@ -303,25 +329,25 @@
           <w:rFonts w:ascii="Times New Roman" w:hAnsi="Times New Roman" w:eastAsia="Times New Roman"/>
           <w:b/>
           <w:i w:val="0"/>
-          <w:sz w:val="18"/>
+          <w:sz w:val="21"/>
         </w:rPr>
-        <w:t xml:space="preserve">Ownership: </w:t>
+        <w:t xml:space="preserve">Reporting: </w:t>
       </w:r>
       <w:r>
         <w:rPr>
           <w:rFonts w:ascii="Times New Roman" w:hAnsi="Times New Roman" w:eastAsia="Times New Roman"/>
           <w:b w:val="0"/>
           <w:i w:val="0"/>
-          <w:sz w:val="18"/>
+          <w:sz w:val="21"/>
         </w:rPr>
-        <w:t>Developed report features and implemented file export and file-generation workflows based on business requirements.</w:t>
+        <w:t>Owned report features and translated accounting requirements into practical reporting workflows.</w:t>
       </w:r>
     </w:p>
     <w:p>
       <w:pPr>
         <w:pStyle w:val="ListBullet"/>
         <w:widowControl/>
-        <w:spacing w:before="0" w:after="5" w:line="226" w:lineRule="auto"/>
+        <w:spacing w:before="0" w:after="15" w:line="240" w:lineRule="auto"/>
         <w:ind w:left="340" w:hanging="198"/>
       </w:pPr>
       <w:r>
@@ -329,7 +355,33 @@
           <w:rFonts w:ascii="Times New Roman" w:hAnsi="Times New Roman" w:eastAsia="Times New Roman"/>
           <w:b/>
           <w:i w:val="0"/>
-          <w:sz w:val="18"/>
+          <w:sz w:val="21"/>
+        </w:rPr>
+        <w:t xml:space="preserve">File workflows: </w:t>
+      </w:r>
+      <w:r>
+        <w:rPr>
+          <w:rFonts w:ascii="Times New Roman" w:hAnsi="Times New Roman" w:eastAsia="Times New Roman"/>
+          <w:b w:val="0"/>
+          <w:i w:val="0"/>
+          <w:sz w:val="21"/>
+        </w:rPr>
+        <w:t>Implemented export and file-generation flows based on business rules and operational data.</w:t>
+      </w:r>
+    </w:p>
+    <w:p>
+      <w:pPr>
+        <w:pStyle w:val="ListBullet"/>
+        <w:widowControl/>
+        <w:spacing w:before="0" w:after="15" w:line="240" w:lineRule="auto"/>
+        <w:ind w:left="340" w:hanging="198"/>
+      </w:pPr>
+      <w:r>
+        <w:rPr>
+          <w:rFonts w:ascii="Times New Roman" w:hAnsi="Times New Roman" w:eastAsia="Times New Roman"/>
+          <w:b/>
+          <w:i w:val="0"/>
+          <w:sz w:val="21"/>
         </w:rPr>
         <w:t xml:space="preserve">Tech stack: </w:t>
       </w:r>
@@ -338,7 +390,7 @@
           <w:rFonts w:ascii="Times New Roman" w:hAnsi="Times New Roman" w:eastAsia="Times New Roman"/>
           <w:b w:val="0"/>
           <w:i w:val="0"/>
-          <w:sz w:val="18"/>
+          <w:sz w:val="21"/>
         </w:rPr>
         <w:t>TanStack React frontend, TypeScript, and C# backend.</w:t>
       </w:r>
@@ -346,7 +398,7 @@
     <w:p>
       <w:pPr>
         <w:widowControl/>
-        <w:spacing w:before="30" w:after="10" w:line="230" w:lineRule="auto"/>
+        <w:spacing w:before="48" w:after="20" w:line="240" w:lineRule="auto"/>
         <w:keepNext/>
       </w:pPr>
       <w:r>
@@ -354,7 +406,7 @@
           <w:rFonts w:ascii="Times New Roman" w:hAnsi="Times New Roman" w:eastAsia="Times New Roman"/>
           <w:b/>
           <w:i w:val="0"/>
-          <w:sz w:val="20"/>
+          <w:sz w:val="23"/>
         </w:rPr>
         <w:t>Software Engineer / Team Leader | Blameo (Outsourcing for Viettel Group) | Jun 2022 - Present</w:t>
       </w:r>
@@ -363,7 +415,7 @@
       <w:pPr>
         <w:pStyle w:val="ListBullet"/>
         <w:widowControl/>
-        <w:spacing w:before="0" w:after="5" w:line="226" w:lineRule="auto"/>
+        <w:spacing w:before="0" w:after="15" w:line="240" w:lineRule="auto"/>
         <w:ind w:left="340" w:hanging="198"/>
       </w:pPr>
       <w:r>
@@ -371,7 +423,7 @@
           <w:rFonts w:ascii="Times New Roman" w:hAnsi="Times New Roman" w:eastAsia="Times New Roman"/>
           <w:b/>
           <w:i w:val="0"/>
-          <w:sz w:val="18"/>
+          <w:sz w:val="21"/>
         </w:rPr>
         <w:t xml:space="preserve">Leadership: </w:t>
       </w:r>
@@ -380,7 +432,7 @@
           <w:rFonts w:ascii="Times New Roman" w:hAnsi="Times New Roman" w:eastAsia="Times New Roman"/>
           <w:b w:val="0"/>
           <w:i w:val="0"/>
-          <w:sz w:val="18"/>
+          <w:sz w:val="21"/>
         </w:rPr>
         <w:t>Led and mentored 8 engineers; built technical interview and mentorship practices for team growth.</w:t>
       </w:r>
@@ -389,7 +441,7 @@
       <w:pPr>
         <w:pStyle w:val="ListBullet"/>
         <w:widowControl/>
-        <w:spacing w:before="0" w:after="5" w:line="226" w:lineRule="auto"/>
+        <w:spacing w:before="0" w:after="15" w:line="240" w:lineRule="auto"/>
         <w:ind w:left="340" w:hanging="198"/>
       </w:pPr>
       <w:r>
@@ -397,7 +449,33 @@
           <w:rFonts w:ascii="Times New Roman" w:hAnsi="Times New Roman" w:eastAsia="Times New Roman"/>
           <w:b/>
           <w:i w:val="0"/>
-          <w:sz w:val="18"/>
+          <w:sz w:val="21"/>
+        </w:rPr>
+        <w:t xml:space="preserve">Team development: </w:t>
+      </w:r>
+      <w:r>
+        <w:rPr>
+          <w:rFonts w:ascii="Times New Roman" w:hAnsi="Times New Roman" w:eastAsia="Times New Roman"/>
+          <w:b w:val="0"/>
+          <w:i w:val="0"/>
+          <w:sz w:val="21"/>
+        </w:rPr>
+        <w:t>Defined engineering expectations and supported interns and developers through structured feedback and coaching.</w:t>
+      </w:r>
+    </w:p>
+    <w:p>
+      <w:pPr>
+        <w:pStyle w:val="ListBullet"/>
+        <w:widowControl/>
+        <w:spacing w:before="0" w:after="15" w:line="240" w:lineRule="auto"/>
+        <w:ind w:left="340" w:hanging="198"/>
+      </w:pPr>
+      <w:r>
+        <w:rPr>
+          <w:rFonts w:ascii="Times New Roman" w:hAnsi="Times New Roman" w:eastAsia="Times New Roman"/>
+          <w:b/>
+          <w:i w:val="0"/>
+          <w:sz w:val="21"/>
         </w:rPr>
         <w:t xml:space="preserve">Architecture: </w:t>
       </w:r>
@@ -406,7 +484,7 @@
           <w:rFonts w:ascii="Times New Roman" w:hAnsi="Times New Roman" w:eastAsia="Times New Roman"/>
           <w:b w:val="0"/>
           <w:i w:val="0"/>
-          <w:sz w:val="18"/>
+          <w:sz w:val="21"/>
         </w:rPr>
         <w:t>Refactored legacy Node.js services, reducing API latency by 50% and improving peak-load reliability.</w:t>
       </w:r>
@@ -415,7 +493,7 @@
       <w:pPr>
         <w:pStyle w:val="ListBullet"/>
         <w:widowControl/>
-        <w:spacing w:before="0" w:after="5" w:line="226" w:lineRule="auto"/>
+        <w:spacing w:before="0" w:after="15" w:line="240" w:lineRule="auto"/>
         <w:ind w:left="340" w:hanging="198"/>
       </w:pPr>
       <w:r>
@@ -423,7 +501,7 @@
           <w:rFonts w:ascii="Times New Roman" w:hAnsi="Times New Roman" w:eastAsia="Times New Roman"/>
           <w:b/>
           <w:i w:val="0"/>
-          <w:sz w:val="18"/>
+          <w:sz w:val="21"/>
         </w:rPr>
         <w:t xml:space="preserve">Product delivery: </w:t>
       </w:r>
@@ -432,7 +510,7 @@
           <w:rFonts w:ascii="Times New Roman" w:hAnsi="Times New Roman" w:eastAsia="Times New Roman"/>
           <w:b w:val="0"/>
           <w:i w:val="0"/>
-          <w:sz w:val="18"/>
+          <w:sz w:val="21"/>
         </w:rPr>
         <w:t>Built KPI management and Viettel Cloud features with React, TypeScript, and Node.js; introduced ESLint and Git flow standards.</w:t>
       </w:r>
@@ -440,7 +518,7 @@
     <w:p>
       <w:pPr>
         <w:widowControl/>
-        <w:spacing w:before="30" w:after="10" w:line="230" w:lineRule="auto"/>
+        <w:spacing w:before="48" w:after="20" w:line="240" w:lineRule="auto"/>
         <w:keepNext/>
       </w:pPr>
       <w:r>
@@ -448,7 +526,7 @@
           <w:rFonts w:ascii="Times New Roman" w:hAnsi="Times New Roman" w:eastAsia="Times New Roman"/>
           <w:b/>
           <w:i w:val="0"/>
-          <w:sz w:val="20"/>
+          <w:sz w:val="23"/>
         </w:rPr>
         <w:t>Software Engineer | CMC Global | Oct 2021 - Jun 2022</w:t>
       </w:r>
@@ -457,7 +535,7 @@
       <w:pPr>
         <w:pStyle w:val="ListBullet"/>
         <w:widowControl/>
-        <w:spacing w:before="0" w:after="5" w:line="226" w:lineRule="auto"/>
+        <w:spacing w:before="0" w:after="15" w:line="240" w:lineRule="auto"/>
         <w:ind w:left="340" w:hanging="198"/>
       </w:pPr>
       <w:r>
@@ -465,7 +543,7 @@
           <w:rFonts w:ascii="Times New Roman" w:hAnsi="Times New Roman" w:eastAsia="Times New Roman"/>
           <w:b/>
           <w:i w:val="0"/>
-          <w:sz w:val="18"/>
+          <w:sz w:val="21"/>
         </w:rPr>
         <w:t xml:space="preserve">Naver Cloud Meeting: </w:t>
       </w:r>
@@ -474,15 +552,41 @@
           <w:rFonts w:ascii="Times New Roman" w:hAnsi="Times New Roman" w:eastAsia="Times New Roman"/>
           <w:b w:val="0"/>
           <w:i w:val="0"/>
-          <w:sz w:val="18"/>
+          <w:sz w:val="21"/>
         </w:rPr>
-        <w:t>Engineered video conferencing across Vue.js web, Electron desktop, and React Native mobile; implemented RTC media synchronization and joined architecture/code reviews.</w:t>
+        <w:t>Engineered video conferencing across Vue.js web, Electron desktop, and React Native mobile.</w:t>
+      </w:r>
+    </w:p>
+    <w:p>
+      <w:pPr>
+        <w:pStyle w:val="ListBullet"/>
+        <w:widowControl/>
+        <w:spacing w:before="0" w:after="15" w:line="240" w:lineRule="auto"/>
+        <w:ind w:left="340" w:hanging="198"/>
+      </w:pPr>
+      <w:r>
+        <w:rPr>
+          <w:rFonts w:ascii="Times New Roman" w:hAnsi="Times New Roman" w:eastAsia="Times New Roman"/>
+          <w:b/>
+          <w:i w:val="0"/>
+          <w:sz w:val="21"/>
+        </w:rPr>
+        <w:t xml:space="preserve">RTC &amp; quality: </w:t>
+      </w:r>
+      <w:r>
+        <w:rPr>
+          <w:rFonts w:ascii="Times New Roman" w:hAnsi="Times New Roman" w:eastAsia="Times New Roman"/>
+          <w:b w:val="0"/>
+          <w:i w:val="0"/>
+          <w:sz w:val="21"/>
+        </w:rPr>
+        <w:t>Implemented media synchronization across devices and bandwidths; contributed to architecture and code reviews.</w:t>
       </w:r>
     </w:p>
     <w:p>
       <w:pPr>
         <w:widowControl/>
-        <w:spacing w:before="30" w:after="10" w:line="230" w:lineRule="auto"/>
+        <w:spacing w:before="48" w:after="20" w:line="240" w:lineRule="auto"/>
         <w:keepNext/>
       </w:pPr>
       <w:r>
@@ -490,7 +594,7 @@
           <w:rFonts w:ascii="Times New Roman" w:hAnsi="Times New Roman" w:eastAsia="Times New Roman"/>
           <w:b/>
           <w:i w:val="0"/>
-          <w:sz w:val="20"/>
+          <w:sz w:val="23"/>
         </w:rPr>
         <w:t>Frontend Developer | NTQ Solution | Oct 2020 - Oct 2021</w:t>
       </w:r>
@@ -499,7 +603,7 @@
       <w:pPr>
         <w:pStyle w:val="ListBullet"/>
         <w:widowControl/>
-        <w:spacing w:before="0" w:after="5" w:line="226" w:lineRule="auto"/>
+        <w:spacing w:before="0" w:after="15" w:line="240" w:lineRule="auto"/>
         <w:ind w:left="340" w:hanging="198"/>
       </w:pPr>
       <w:r>
@@ -507,24 +611,50 @@
           <w:rFonts w:ascii="Times New Roman" w:hAnsi="Times New Roman" w:eastAsia="Times New Roman"/>
           <w:b/>
           <w:i w:val="0"/>
-          <w:sz w:val="18"/>
+          <w:sz w:val="21"/>
         </w:rPr>
-        <w:t xml:space="preserve">Mobile products: </w:t>
+        <w:t xml:space="preserve">Low-code platform: </w:t>
       </w:r>
       <w:r>
         <w:rPr>
           <w:rFonts w:ascii="Times New Roman" w:hAnsi="Times New Roman" w:eastAsia="Times New Roman"/>
           <w:b w:val="0"/>
           <w:i w:val="0"/>
-          <w:sz w:val="18"/>
+          <w:sz w:val="21"/>
         </w:rPr>
-        <w:t>Built core features for a React Native low-code app-generation platform and GoPass exam/e-learning application.</w:t>
+        <w:t>Built core features for a React Native app-generation platform focused on automation and dynamic functionality.</w:t>
+      </w:r>
+    </w:p>
+    <w:p>
+      <w:pPr>
+        <w:pStyle w:val="ListBullet"/>
+        <w:widowControl/>
+        <w:spacing w:before="0" w:after="15" w:line="240" w:lineRule="auto"/>
+        <w:ind w:left="340" w:hanging="198"/>
+      </w:pPr>
+      <w:r>
+        <w:rPr>
+          <w:rFonts w:ascii="Times New Roman" w:hAnsi="Times New Roman" w:eastAsia="Times New Roman"/>
+          <w:b/>
+          <w:i w:val="0"/>
+          <w:sz w:val="21"/>
+        </w:rPr>
+        <w:t xml:space="preserve">GoPass e-learning: </w:t>
+      </w:r>
+      <w:r>
+        <w:rPr>
+          <w:rFonts w:ascii="Times New Roman" w:hAnsi="Times New Roman" w:eastAsia="Times New Roman"/>
+          <w:b w:val="0"/>
+          <w:i w:val="0"/>
+          <w:sz w:val="21"/>
+        </w:rPr>
+        <w:t>Developed exam and e-learning flows with intuitive interfaces and smooth interactive experiences.</w:t>
       </w:r>
     </w:p>
     <w:p>
       <w:pPr>
         <w:widowControl/>
-        <w:spacing w:before="110" w:after="50" w:line="240" w:lineRule="auto"/>
+        <w:spacing w:before="150" w:after="70" w:line="240" w:lineRule="auto"/>
         <w:jc w:val="center"/>
         <w:keepNext/>
       </w:pPr>
@@ -533,7 +663,7 @@
           <w:rFonts w:ascii="Times New Roman" w:hAnsi="Times New Roman" w:eastAsia="Times New Roman"/>
           <w:b/>
           <w:i w:val="0"/>
-          <w:sz w:val="25"/>
+          <w:sz w:val="29"/>
         </w:rPr>
         <w:t>SKILLS</w:t>
       </w:r>
@@ -542,7 +672,7 @@
       <w:pPr>
         <w:pStyle w:val="ListBullet"/>
         <w:widowControl/>
-        <w:spacing w:before="0" w:after="6" w:line="226" w:lineRule="auto"/>
+        <w:spacing w:before="0" w:after="16" w:line="240" w:lineRule="auto"/>
         <w:ind w:left="340" w:hanging="198"/>
       </w:pPr>
       <w:r>
@@ -550,7 +680,7 @@
           <w:rFonts w:ascii="Times New Roman" w:hAnsi="Times New Roman" w:eastAsia="Times New Roman"/>
           <w:b/>
           <w:i w:val="0"/>
-          <w:sz w:val="18"/>
+          <w:sz w:val="21"/>
         </w:rPr>
         <w:t xml:space="preserve">Fullstack: </w:t>
       </w:r>
@@ -559,7 +689,7 @@
           <w:rFonts w:ascii="Times New Roman" w:hAnsi="Times New Roman" w:eastAsia="Times New Roman"/>
           <w:b w:val="0"/>
           <w:i w:val="0"/>
-          <w:sz w:val="18"/>
+          <w:sz w:val="21"/>
         </w:rPr>
         <w:t>TypeScript, JavaScript, React, Next.js, Node.js (NestJS/Express), React Native, Vue.js, Electron.js.</w:t>
       </w:r>
@@ -568,7 +698,7 @@
       <w:pPr>
         <w:pStyle w:val="ListBullet"/>
         <w:widowControl/>
-        <w:spacing w:before="0" w:after="6" w:line="226" w:lineRule="auto"/>
+        <w:spacing w:before="0" w:after="16" w:line="240" w:lineRule="auto"/>
         <w:ind w:left="340" w:hanging="198"/>
       </w:pPr>
       <w:r>
@@ -576,7 +706,7 @@
           <w:rFonts w:ascii="Times New Roman" w:hAnsi="Times New Roman" w:eastAsia="Times New Roman"/>
           <w:b/>
           <w:i w:val="0"/>
-          <w:sz w:val="18"/>
+          <w:sz w:val="21"/>
         </w:rPr>
         <w:t xml:space="preserve">Backend &amp; Data: </w:t>
       </w:r>
@@ -585,7 +715,7 @@
           <w:rFonts w:ascii="Times New Roman" w:hAnsi="Times New Roman" w:eastAsia="Times New Roman"/>
           <w:b w:val="0"/>
           <w:i w:val="0"/>
-          <w:sz w:val="18"/>
+          <w:sz w:val="21"/>
         </w:rPr>
         <w:t>PostgreSQL, SQLite, Realm DB, Keycloak, OCR assessment workflows.</w:t>
       </w:r>
@@ -594,7 +724,7 @@
       <w:pPr>
         <w:pStyle w:val="ListBullet"/>
         <w:widowControl/>
-        <w:spacing w:before="0" w:after="6" w:line="226" w:lineRule="auto"/>
+        <w:spacing w:before="0" w:after="16" w:line="240" w:lineRule="auto"/>
         <w:ind w:left="340" w:hanging="198"/>
       </w:pPr>
       <w:r>
@@ -602,7 +732,7 @@
           <w:rFonts w:ascii="Times New Roman" w:hAnsi="Times New Roman" w:eastAsia="Times New Roman"/>
           <w:b/>
           <w:i w:val="0"/>
-          <w:sz w:val="18"/>
+          <w:sz w:val="21"/>
         </w:rPr>
         <w:t xml:space="preserve">Delivery: </w:t>
       </w:r>
@@ -611,7 +741,7 @@
           <w:rFonts w:ascii="Times New Roman" w:hAnsi="Times New Roman" w:eastAsia="Times New Roman"/>
           <w:b w:val="0"/>
           <w:i w:val="0"/>
-          <w:sz w:val="18"/>
+          <w:sz w:val="21"/>
         </w:rPr>
         <w:t>Docker, Jenkins, GitLab CI/CD, GitHub Actions, Nginx, AWS, Linux/Ubuntu.</w:t>
       </w:r>
@@ -620,7 +750,7 @@
       <w:pPr>
         <w:pStyle w:val="ListBullet"/>
         <w:widowControl/>
-        <w:spacing w:before="0" w:after="6" w:line="226" w:lineRule="auto"/>
+        <w:spacing w:before="0" w:after="16" w:line="240" w:lineRule="auto"/>
         <w:ind w:left="340" w:hanging="198"/>
       </w:pPr>
       <w:r>
@@ -628,7 +758,7 @@
           <w:rFonts w:ascii="Times New Roman" w:hAnsi="Times New Roman" w:eastAsia="Times New Roman"/>
           <w:b/>
           <w:i w:val="0"/>
-          <w:sz w:val="18"/>
+          <w:sz w:val="21"/>
         </w:rPr>
         <w:t xml:space="preserve">Leadership: </w:t>
       </w:r>
@@ -637,7 +767,7 @@
           <w:rFonts w:ascii="Times New Roman" w:hAnsi="Times New Roman" w:eastAsia="Times New Roman"/>
           <w:b w:val="0"/>
           <w:i w:val="0"/>
-          <w:sz w:val="18"/>
+          <w:sz w:val="21"/>
         </w:rPr>
         <w:t>System Architecture, Team Mentoring, Technical Interviewing, Agile/Scrum, CI/CD design.</w:t>
       </w:r>
@@ -645,7 +775,7 @@
     <w:p>
       <w:pPr>
         <w:widowControl/>
-        <w:spacing w:before="110" w:after="50" w:line="240" w:lineRule="auto"/>
+        <w:spacing w:before="150" w:after="70" w:line="240" w:lineRule="auto"/>
         <w:jc w:val="center"/>
         <w:keepNext/>
       </w:pPr>
@@ -654,7 +784,7 @@
           <w:rFonts w:ascii="Times New Roman" w:hAnsi="Times New Roman" w:eastAsia="Times New Roman"/>
           <w:b/>
           <w:i w:val="0"/>
-          <w:sz w:val="25"/>
+          <w:sz w:val="29"/>
         </w:rPr>
         <w:t>TITLES AND AWARDS</w:t>
       </w:r>
@@ -669,14 +799,14 @@
           <w:rFonts w:ascii="Times New Roman" w:hAnsi="Times New Roman" w:eastAsia="Times New Roman"/>
           <w:b w:val="0"/>
           <w:i w:val="0"/>
-          <w:sz w:val="18"/>
+          <w:sz w:val="21"/>
         </w:rPr>
         <w:t>May 2023     Employee of the Year - Blameo Company</w:t>
       </w:r>
     </w:p>
     <w:sectPr>
       <w:pgSz w:w="11906" w:h="16838"/>
-      <w:pgMar w:top="595" w:right="765" w:bottom="595" w:left="765" w:header="283" w:footer="283" w:gutter="0"/>
+      <w:pgMar w:top="794" w:right="850" w:bottom="794" w:left="850" w:header="283" w:footer="283" w:gutter="0"/>
       <w:cols w:space="720"/>
       <w:docGrid w:linePitch="360"/>
     </w:sectPr>
@@ -1049,7 +1179,7 @@
     <w:rsid w:val="00FC693F"/>
     <w:rPr>
       <w:rFonts w:ascii="Times New Roman" w:hAnsi="Times New Roman" w:eastAsia="Times New Roman"/>
-      <w:sz w:val="18"/>
+      <w:sz w:val="21"/>
     </w:rPr>
   </w:style>
   <w:style w:type="paragraph" w:styleId="Header">
@@ -1582,7 +1712,7 @@
     </w:pPr>
     <w:rPr>
       <w:rFonts w:ascii="Times New Roman" w:hAnsi="Times New Roman" w:eastAsia="Times New Roman"/>
-      <w:sz w:val="18"/>
+      <w:sz w:val="21"/>
     </w:rPr>
   </w:style>
   <w:style w:type="paragraph" w:styleId="ListBullet2">
@@ -1625,7 +1755,7 @@
     </w:pPr>
     <w:rPr>
       <w:rFonts w:ascii="Times New Roman" w:hAnsi="Times New Roman" w:eastAsia="Times New Roman"/>
-      <w:sz w:val="18"/>
+      <w:sz w:val="21"/>
     </w:rPr>
   </w:style>
   <w:style w:type="paragraph" w:styleId="ListNumber2">

</xml_diff>